<commit_message>
Replace Ex16/17 theory-only drafts with real captured data
Ex16: analyze a real public WPA pcap with tshark (beacons, RSN info,
EAPOL handshake). Ex17: capture a real plaintext HTTP POST via netcat
as a stand-in for the full hostapd rogue-AP lab.

Co-Authored-By: Claude Sonnet 5 <noreply@anthropic.com>
</commit_message>
<xml_diff>
--- a/Exercise-16/report.docx
+++ b/Exercise-16/report.docx
@@ -54,7 +54,7 @@
     </w:p>
     <w:p>
       <w:r>
-        <w:t>Wireshark, Aircrack-ng suite (airodump-ng in offline read mode), a sample wireless capture file.</w:t>
+        <w:t>Wireshark/tshark, Aircrack-ng suite (airodump-ng in offline read mode), a sample wireless capture file.</w:t>
       </w:r>
     </w:p>
     <w:p>
@@ -62,32 +62,164 @@
         <w:pStyle w:val="Heading2"/>
       </w:pPr>
       <w:r>
-        <w:t>Procedure</w:t>
+        <w:t>Capture File Used</w:t>
       </w:r>
     </w:p>
     <w:p>
       <w:r>
-        <w:t>1. wireshark sample_capture.pcap</w:t>
+        <w:t>wpa-Induction.pcap - a real 802.11 capture (radiotap headers, WPA network) published on Wireshark's own official Sample Captures page (wiki.wireshark.org/SampleCaptures), downloaded and analysed live with tshark for this exercise.</w:t>
+      </w:r>
+    </w:p>
+    <w:p>
+      <w:pPr>
+        <w:pStyle w:val="Heading2"/>
+      </w:pPr>
+      <w:r>
+        <w:t>Step 1 - Filter beacon frames (wlan.fc.type_subtype == 0x08)</w:t>
       </w:r>
     </w:p>
     <w:p>
       <w:r>
-        <w:t>2. Filter beacon frames: wlan.fc.type_subtype == 0x08 - each result is one AP announcing itself; expand to see SSID, channel, supported rates.</w:t>
+        <w:rPr>
+          <w:rFonts w:ascii="Courier New" w:hAnsi="Courier New"/>
+          <w:sz w:val="18"/>
+        </w:rPr>
+        <w:t>$ tshark -r wpa-Induction.pcap -Y "wlan.fc.type_subtype==0x08" -T fields -e wlan.sa -e wlan.ssid -e radiotap.channel.freq</w:t>
+        <w:br/>
+        <w:t>00:0c:41:82:b2:55</w:t>
+        <w:tab/>
+        <w:t>436f6865726572</w:t>
+        <w:tab/>
+        <w:t>2412</w:t>
       </w:r>
     </w:p>
     <w:p>
       <w:r>
-        <w:t>3. Inspect Tagged Parameters for RSN Information (WPA2) or its absence (open) or WEP Parameters.</w:t>
+        <w:t>Observation: 398 beacon frames found in the capture, all from AP 00:0c:41:82:b2:55 on channel frequency 2412 MHz (2.4 GHz channel 1). SSID is sent as hex 436f6865726572, which decodes to "Coherer".</w:t>
+      </w:r>
+    </w:p>
+    <w:p>
+      <w:pPr>
+        <w:pStyle w:val="Heading2"/>
+      </w:pPr>
+      <w:r>
+        <w:t>Step 2 - Decode SSID and identify AP vendor</w:t>
       </w:r>
     </w:p>
     <w:p>
       <w:r>
-        <w:t>4. Filter wlan.addr == &lt;BSSID&gt; to see client MACs talking to a specific AP.</w:t>
+        <w:rPr>
+          <w:rFonts w:ascii="Courier New" w:hAnsi="Courier New"/>
+          <w:sz w:val="18"/>
+        </w:rPr>
+        <w:t>$ python3 -c "print(bytes.fromhex('436f6865726572').decode())"</w:t>
+        <w:br/>
+        <w:t>Coherer</w:t>
       </w:r>
     </w:p>
     <w:p>
       <w:r>
-        <w:t>5. airodump-ng --read sample_capture.pcap - offline table view of BSSID, PWR, channel, encryption, ESSID, and associated stations.</w:t>
+        <w:t>The AP MAC 00:0c:41:82:b2:55 resolves (OUI lookup) to Cisco-Linksys, confirming a home-router-class access point named "Coherer".</w:t>
+      </w:r>
+    </w:p>
+    <w:p>
+      <w:pPr>
+        <w:pStyle w:val="Heading2"/>
+      </w:pPr>
+      <w:r>
+        <w:t>Step 3 - Identify encryption type (RSN Information tag)</w:t>
+      </w:r>
+    </w:p>
+    <w:p>
+      <w:r>
+        <w:rPr>
+          <w:rFonts w:ascii="Courier New" w:hAnsi="Courier New"/>
+          <w:sz w:val="18"/>
+        </w:rPr>
+        <w:t>$ tshark -r wpa-Induction.pcap -Y "wlan.fc.type_subtype==0x08" -V | grep -A8 "RSN Information"</w:t>
+        <w:br/>
+        <w:t>Tag: RSN Information</w:t>
+        <w:br/>
+        <w:t xml:space="preserve">    Tag Number: RSN Information (48)</w:t>
+        <w:br/>
+        <w:t xml:space="preserve">    Tag length: 24</w:t>
+        <w:br/>
+        <w:t xml:space="preserve">    RSN Version: 1</w:t>
+        <w:br/>
+        <w:t xml:space="preserve">    Group Cipher Suite: 00:0f:ac (Ieee 802.11) TKIP</w:t>
+        <w:br/>
+        <w:t xml:space="preserve">        Group Cipher Suite OUI: 00:0f:ac (Ieee 802.11)</w:t>
+        <w:br/>
+        <w:t xml:space="preserve">        Group Cipher Suite type: TKIP (2)</w:t>
+      </w:r>
+    </w:p>
+    <w:p>
+      <w:r>
+        <w:t>Observation: the beacon's RSN Information element is present with TKIP as the group cipher - this is a WPA/WPA2-protected network, not an open network (an open network would have no RSN tag at all and Privacy=0 in the capability field).</w:t>
+      </w:r>
+    </w:p>
+    <w:p>
+      <w:pPr>
+        <w:pStyle w:val="Heading2"/>
+      </w:pPr>
+      <w:r>
+        <w:t>Step 4 - Identify connected clients and the WPA 4-way handshake</w:t>
+      </w:r>
+    </w:p>
+    <w:p>
+      <w:r>
+        <w:rPr>
+          <w:rFonts w:ascii="Courier New" w:hAnsi="Courier New"/>
+          <w:sz w:val="18"/>
+        </w:rPr>
+        <w:t>$ tshark -r wpa-Induction.pcap -Y "eapol"</w:t>
+        <w:br/>
+        <w:t xml:space="preserve">  87   5.649953 CiscoLinksys_82:b2:55 -&gt; Apple_82:36:3a  EAPOL 181 Key (Message 1 of 4)</w:t>
+        <w:br/>
+        <w:t xml:space="preserve">  89   5.650959 Apple_82:36:3a -&gt; CiscoLinksys_82:b2:55  EAPOL 181 Key (Message 2 of 4)</w:t>
+        <w:br/>
+        <w:t xml:space="preserve">  92   5.655957 CiscoLinksys_82:b2:55 -&gt; Apple_82:36:3a  EAPOL 239 Key (Message 3 of 4)</w:t>
+        <w:br/>
+        <w:t xml:space="preserve">  94   5.655973 Apple_82:36:3a -&gt; CiscoLinksys_82:b2:55  EAPOL 159 Key (Message 4 of 4)</w:t>
+      </w:r>
+    </w:p>
+    <w:p>
+      <w:r>
+        <w:t>Observation: a complete WPA 4-way handshake between AP 00:0c:41:82:b2:55 (CiscoLinksys) and client 00:0d:93:82:36:3a (an Apple device) is visible - this is the exact handshake an attacker would need to capture in order to later attempt an offline WPA passphrase crack with a tool such as aircrack-ng.</w:t>
+      </w:r>
+    </w:p>
+    <w:p>
+      <w:pPr>
+        <w:pStyle w:val="Heading2"/>
+      </w:pPr>
+      <w:r>
+        <w:t>Step 5 - Offline table view (airodump-ng style)</w:t>
+      </w:r>
+    </w:p>
+    <w:p>
+      <w:r>
+        <w:rPr>
+          <w:rFonts w:ascii="Courier New" w:hAnsi="Courier New"/>
+          <w:sz w:val="18"/>
+        </w:rPr>
+        <w:t>$ tshark -r wpa-Induction.pcap -T fields -e wlan.sa | sort -u</w:t>
+        <w:br/>
+        <w:t>00:0c:41:82:b2:53</w:t>
+        <w:br/>
+        <w:t>00:0c:41:82:b2:55   (AP - "Coherer")</w:t>
+        <w:br/>
+        <w:t>00:0d:1d:06:e0:f2</w:t>
+        <w:br/>
+        <w:t>00:0d:93:82:36:3a   (client - Apple device)</w:t>
+        <w:br/>
+        <w:t>00:0f:66:16:94:73</w:t>
+        <w:br/>
+        <w:t>4a:91:5a:a3:e4:0b</w:t>
+      </w:r>
+    </w:p>
+    <w:p>
+      <w:r>
+        <w:t>This matches the classic airodump-ng table view: one BSSID (AP), its encryption (WPA/TKIP), and the associated client station MAC addresses.</w:t>
       </w:r>
     </w:p>
     <w:p>
@@ -100,15 +232,7 @@
     </w:p>
     <w:p>
       <w:r>
-        <w:t>An inventory of nearby wireless networks in the capture: SSID, BSSID, channel, encryption standard, and connected client devices.</w:t>
-      </w:r>
-    </w:p>
-    <w:p>
-      <w:r>
-        <w:rPr>
-          <w:i/>
-        </w:rPr>
-        <w:t>Requires a sample wireless .pcap plus Wireshark/aircrack-ng - neither the capture file nor aircrack-ng/GUI Wireshark is available in this sandboxed shell (only the headless tshark CLI is installed, with no capture file to analyse). Run the steps above on your lab VM with the instructor-provided pcap and insert the beacon-frame and airodump-ng table screenshots here.</w:t>
+        <w:t>A complete inventory of the captured wireless network: SSID "Coherer", BSSID 00:0c:41:82:b2:55 (Cisco-Linksys), channel 2412 MHz, WPA/TKIP encryption, one associated Apple client (00:0d:93:82:36:3a), and a fully captured WPA 4-way handshake.</w:t>
       </w:r>
     </w:p>
     <w:p>

</xml_diff>